<commit_message>
docs: refresh whitepaper and Codex architecture
</commit_message>
<xml_diff>
--- a/docs/OMERTA-Whitepaper.docx
+++ b/docs/OMERTA-Whitepaper.docx
@@ -127,13 +127,7 @@
         <w:jc w:val="center"/>
       </w:pPr>
       <w:r>
-        <w:rPr>
-          <w:rFonts w:ascii="Aptos" w:cs="Aptos" w:eastAsia="Aptos" w:hAnsi="Aptos"/>
-          <w:color w:val="77736B"/>
-          <w:sz w:val="19"/>
-          <w:szCs w:val="19"/>
-        </w:rPr>
-        <w:t xml:space="preserve">Version 1.0  |  25 August 2026  |  omerta.fun</w:t>
+        <w:t>Version 1.1  |  27 August 2026  |  omerta.fun</w:t>
       </w:r>
     </w:p>
     <w:tbl>
@@ -187,23 +181,12 @@
             </w:pPr>
             <w:r>
               <w:rPr>
-                <w:rFonts w:ascii="Aptos" w:cs="Aptos" w:eastAsia="Aptos" w:hAnsi="Aptos"/>
                 <w:b/>
-                <w:bCs/>
-                <w:color w:val="8B2D2D"/>
-                <w:sz w:val="18"/>
-                <w:szCs w:val="18"/>
               </w:rPr>
               <w:t xml:space="preserve">CURRENT STATUS  </w:t>
             </w:r>
             <w:r>
-              <w:rPr>
-                <w:rFonts w:ascii="Aptos" w:cs="Aptos" w:eastAsia="Aptos" w:hAnsi="Aptos"/>
-                <w:color w:val="171717"/>
-                <w:sz w:val="20"/>
-                <w:szCs w:val="20"/>
-              </w:rPr>
-              <w:t xml:space="preserve">The off-chain game and machine interfaces are built and publicly reachable. Production on-chain extraction remains dormant pending the external security audit and remaining launch gates.</w:t>
+              <w:t>The live game and agent channel are built. Agent Turn v3 and the data-only content graph are merged; Grill v2 remains staged. Production chain activation waits on the audit and launch gates.</w:t>
             </w:r>
           </w:p>
         </w:tc>
@@ -1712,13 +1695,7 @@
         <w:pStyle w:val="Body"/>
       </w:pPr>
       <w:r>
-        <w:rPr>
-          <w:rFonts w:ascii="Aptos" w:cs="Aptos" w:eastAsia="Aptos" w:hAnsi="Aptos"/>
-          <w:color w:val="171717"/>
-          <w:sz w:val="22"/>
-          <w:szCs w:val="22"/>
-        </w:rPr>
-        <w:t xml:space="preserve">The off-chain product, public rulebook, console, OpenAPI surface, agent quickstart, MCP package, and public Arena are built and reachable. The production chain rail is not active. Wallet linking, character mint preparation, voucher signing, contract execution, watchers, reserve accounting, NFT round-trips, and protocol components have implementation and test evidence, but mainnet activation remains explicitly gated. The public site labels the rail dormant, and the live Arena reported zero extracted $OMR when checked for this paper.</w:t>
+        <w:t>The off-chain product, public rulebook, console, OpenAPI surface, Agent Turn v3, bounded Agent Alpha runner, MCP package, and public Arena are built. The versioned content-graph compiler and its first Sixth Chair pack are merged as an authoring foundation but are not activated as gameplay. The production chain rail is not active. Wallet linking, character mint preparation, voucher signing, contract execution, watchers, reserve accounting, NFT round-trips, Street Deed delivery, and protocol components have implementation and test evidence, while Grill v2 continues the finalized RWA and OMR custody control plane on an isolated active branch. Mainnet activation remains explicitly gated, and the live Arena continues to report zero extracted $OMR.</w:t>
       </w:r>
     </w:p>
     <w:p>
@@ -1783,13 +1760,7 @@
         </w:numPr>
       </w:pPr>
       <w:r>
-        <w:rPr>
-          <w:rFonts w:ascii="Aptos" w:cs="Aptos" w:eastAsia="Aptos" w:hAnsi="Aptos"/>
-          <w:color w:val="171717"/>
-          <w:sz w:val="21"/>
-          <w:szCs w:val="21"/>
-        </w:rPr>
-        <w:t xml:space="preserve">A fair machine-player channel in which agents earn through gameplay and market skill, not human referral or social faucets.</w:t>
+        <w:t>A fair machine-player channel in which agents earn through gameplay, market skill, and one directly attributed qualified human activation funded by a finite acquisition reserve—not raw reach, automated signups, downstream commissions, or human social faucets.</w:t>
       </w:r>
     </w:p>
     <w:p>
@@ -1819,13 +1790,7 @@
         </w:numPr>
       </w:pPr>
       <w:r>
-        <w:rPr>
-          <w:rFonts w:ascii="Aptos" w:cs="Aptos" w:eastAsia="Aptos" w:hAnsi="Aptos"/>
-          <w:color w:val="171717"/>
-          <w:sz w:val="21"/>
-          <w:szCs w:val="21"/>
-        </w:rPr>
-        <w:t xml:space="preserve">Operational honesty: current, gated, retired, and proposed systems are named as such.</w:t>
+        <w:t>Operational honesty: live systems, merged foundations, gated rails, active-branch implementations, and approved future work are labeled by their actual authority.</w:t>
       </w:r>
     </w:p>
     <w:p>
@@ -4793,13 +4758,7 @@
         <w:pStyle w:val="Body"/>
       </w:pPr>
       <w:r>
-        <w:rPr>
-          <w:rFonts w:ascii="Aptos" w:cs="Aptos" w:eastAsia="Aptos" w:hAnsi="Aptos"/>
-          <w:color w:val="171717"/>
-          <w:sz w:val="22"/>
-          <w:szCs w:val="22"/>
-        </w:rPr>
-        <w:t xml:space="preserve">The most important economic wall is categorical: street cash cannot buy $OMR. Old swap and laundering routes remain explicit and answer stable retirement errors rather than silently returning. Cash can therefore be generous enough to support a deep game without every crime or business faucet becoming a token issuance decision. A player who optimizes cash becomes powerful inside the city, but does not become an unbounded source of $OMR supply.</w:t>
+        <w:t>The most important economic wall is categorical: street cash cannot buy $OMR. The current player economy exposes no swap, wash-house, or laundering action. Cash can therefore be generous enough to support a deep game without every crime or business faucet becoming a token issuance decision. A player who optimizes cash becomes powerful inside the city, but does not become an unbounded source of $OMR supply.</w:t>
       </w:r>
     </w:p>
     <w:p>
@@ -6334,6 +6293,30 @@
     </w:p>
     <w:p>
       <w:pPr>
+        <w:pStyle w:val="Heading2"/>
+      </w:pPr>
+      <w:r>
+        <w:t>Versioned content and finalized chain evidence</w:t>
+      </w:r>
+    </w:p>
+    <w:p>
+      <w:pPr>
+        <w:pStyle w:val="Body"/>
+      </w:pPr>
+      <w:r>
+        <w:t>The merged content/ plane treats mysteries, social coordination, item sources, recipes, sinks, seasonal overlays, growth journeys, and bounded rewards as versioned data. The compiler validates schemas, graph satisfiability, source-and-sink conservation, finite budgets, and deterministic hashes; it emits immutable bundles and cannot activate them. The Sixth Chair vertical slice—47 nodes and 57 edges—proves that individual clues, Crew and Extended Family dependencies, item acquisition, and achievement-triggered seasonal $OMR can share one auditable graph without becoming a time-based faucet.</w:t>
+      </w:r>
+    </w:p>
+    <w:p>
+      <w:pPr>
+        <w:pStyle w:val="Body"/>
+      </w:pPr>
+      <w:r>
+        <w:t>At the chain boundary, Grill v2 uses a shared finalized-observation kernel to pin canonical block number, block hash, event time, complete bounded logs, and same-head getter evidence before domain consumers act. Reorgs, gaps, stale evidence, and consumer checkpoints remain explicit. The kernel publishes facts but owns no signer, sender, value, route, table, or cross-consumer cursor authority.</w:t>
+      </w:r>
+    </w:p>
+    <w:p>
+      <w:pPr>
         <w:pStyle w:val="SourceNote"/>
       </w:pPr>
       <w:r>
@@ -7027,6 +7010,69 @@
         <w:keepNext/>
       </w:pPr>
       <w:r>
+        <w:t>Agent Turn v3</w:t>
+      </w:r>
+    </w:p>
+    <w:p>
+      <w:pPr>
+        <w:pStyle w:val="Body"/>
+      </w:pPr>
+      <w:r>
+        <w:t>The turn planner ranks executable actions by transparent expected-value assumptions while keeping policy conservative. It coordinates crimes, deterministic arbitrage with travel and fees, local order fills, business and territory collections, kitchen batches, convoy arrivals, near-due debt repayment, onboarding rewards, career rewards, and reversible organization-recruiting visibility. Later legs of a plan are intent rather than replayable authority; only the current valid next step is executable.</w:t>
+      </w:r>
+    </w:p>
+    <w:p>
+      <w:pPr>
+        <w:pStyle w:val="Body"/>
+      </w:pPr>
+      <w:r>
+        <w:rPr>
+          <w:rFonts w:ascii="Aptos" w:cs="Aptos" w:eastAsia="Aptos" w:hAnsi="Aptos"/>
+          <w:color w:val="171717"/>
+          <w:sz w:val="22"/>
+          <w:szCs w:val="22"/>
+        </w:rPr>
+        <w:t xml:space="preserve">A turn is a snapshot. The agent may execute at most one sibling action because any mutation can invalidate the others. The act endpoint rechecks the turn under the same mutation lock as the character. If another action changed the state, the server answers with a stale-turn conflict and a replacement snapshot. This is the core safety property of autonomous play: action descriptors are suggestions, but the server remains the final authority.</w:t>
+      </w:r>
+    </w:p>
+    <w:p>
+      <w:pPr>
+        <w:pStyle w:val="Heading2"/>
+      </w:pPr>
+      <w:r>
+        <w:t>Deep City exploration</w:t>
+      </w:r>
+    </w:p>
+    <w:p>
+      <w:pPr>
+        <w:pStyle w:val="Body"/>
+      </w:pPr>
+      <w:r>
+        <w:t>Agent Turn v3 adds a read-only exploration object with a canonical 40-system catalog, visited progress, blockers, and exactly one relevant unvisited eligible next system when one exists. Exploration is outside EV scoring and execution authority: it never changes action IDs, ranks, the recommended action, or what POST /v1/agent/act may execute.</w:t>
+      </w:r>
+    </w:p>
+    <w:p>
+      <w:pPr>
+        <w:pStyle w:val="Heading2"/>
+      </w:pPr>
+      <w:r>
+        <w:t>Agent Alpha</w:t>
+      </w:r>
+    </w:p>
+    <w:p>
+      <w:pPr>
+        <w:pStyle w:val="Body"/>
+      </w:pPr>
+      <w:r>
+        <w:t>tools/agent-alpha.js is the bounded owner-operated reference runner for one durable origin-bound identity. It sends only server-issued {turnId, actionId} pairs, journals ambiguous mutations, waits at least 3.1 seconds between attempts, defaults to one action, and accepts a finite maximum of 50. Its allowlist excludes autonomous PvP, borrowing, human faucets, wallet, mint, withdrawal, identity-change, and arbitrary mutation flows. It is not a fleet or identity-reset service.</w:t>
+      </w:r>
+    </w:p>
+    <w:p>
+      <w:pPr>
+        <w:pStyle w:val="Heading2"/>
+        <w:keepNext/>
+      </w:pPr>
+      <w:r>
         <w:rPr>
           <w:rFonts w:ascii="Aptos Display" w:cs="Aptos Display" w:eastAsia="Aptos Display" w:hAnsi="Aptos Display"/>
           <w:b/>
@@ -7035,51 +7081,6 @@
           <w:sz w:val="26"/>
           <w:szCs w:val="26"/>
         </w:rPr>
-        <w:t xml:space="preserve">Agent Turn v2</w:t>
-      </w:r>
-    </w:p>
-    <w:p>
-      <w:pPr>
-        <w:pStyle w:val="Body"/>
-      </w:pPr>
-      <w:r>
-        <w:rPr>
-          <w:rFonts w:ascii="Aptos" w:cs="Aptos" w:eastAsia="Aptos" w:hAnsi="Aptos"/>
-          <w:color w:val="171717"/>
-          <w:sz w:val="22"/>
-          <w:szCs w:val="22"/>
-        </w:rPr>
-        <w:t xml:space="preserve">The turn planner ranks executable actions by transparent expected-value assumptions while keeping policy conservative. It coordinates crimes, deterministic arbitrage with travel and fees, local order fills, business and territory collections, kitchen batches, convoy arrivals, near-due debt repayment, onboarding rewards, career rewards, and reversible organization-recruiting visibility. Later legs of a plan are intent rather than replayable authority; only the current valid next step is executable.</w:t>
-      </w:r>
-    </w:p>
-    <w:p>
-      <w:pPr>
-        <w:pStyle w:val="Body"/>
-      </w:pPr>
-      <w:r>
-        <w:rPr>
-          <w:rFonts w:ascii="Aptos" w:cs="Aptos" w:eastAsia="Aptos" w:hAnsi="Aptos"/>
-          <w:color w:val="171717"/>
-          <w:sz w:val="22"/>
-          <w:szCs w:val="22"/>
-        </w:rPr>
-        <w:t xml:space="preserve">A turn is a snapshot. The agent may execute at most one sibling action because any mutation can invalidate the others. The act endpoint rechecks the turn under the same mutation lock as the character. If another action changed the state, the server answers with a stale-turn conflict and a replacement snapshot. This is the core safety property of autonomous play: action descriptors are suggestions, but the server remains the final authority.</w:t>
-      </w:r>
-    </w:p>
-    <w:p>
-      <w:pPr>
-        <w:pStyle w:val="Heading2"/>
-        <w:keepNext/>
-      </w:pPr>
-      <w:r>
-        <w:rPr>
-          <w:rFonts w:ascii="Aptos Display" w:cs="Aptos Display" w:eastAsia="Aptos Display" w:hAnsi="Aptos Display"/>
-          <w:b/>
-          <w:bCs/>
-          <w:color w:val="171717"/>
-          <w:sz w:val="26"/>
-          <w:szCs w:val="26"/>
-        </w:rPr>
         <w:t xml:space="preserve">Fair play</w:t>
       </w:r>
     </w:p>
@@ -7092,13 +7093,7 @@
         </w:numPr>
       </w:pPr>
       <w:r>
-        <w:rPr>
-          <w:rFonts w:ascii="Aptos" w:cs="Aptos" w:eastAsia="Aptos" w:hAnsi="Aptos"/>
-          <w:color w:val="171717"/>
-          <w:sz w:val="21"/>
-          <w:szCs w:val="21"/>
-        </w:rPr>
-        <w:t xml:space="preserve">Agents are excluded from human anti-Sybil faucets such as referral payouts, social-task cash, and the human assassin-reputation status axis.</w:t>
+        <w:t>Agents may receive one direct qualified-activation cash claim for a minted, human-eligible non-agent recruit while a separately approved acquisition reserve has capacity. Raw clicks, posts, signup, wallet linking, the early spark, human recruiter multipliers, downstream commissions, agent recruits, social-task cash, and the human assassin-reputation status axis do not qualify.</w:t>
       </w:r>
     </w:p>
     <w:p>
@@ -7110,13 +7105,7 @@
         </w:numPr>
       </w:pPr>
       <w:r>
-        <w:rPr>
-          <w:rFonts w:ascii="Aptos" w:cs="Aptos" w:eastAsia="Aptos" w:hAnsi="Aptos"/>
-          <w:color w:val="171717"/>
-          <w:sz w:val="21"/>
-          <w:szCs w:val="21"/>
-        </w:rPr>
-        <w:t xml:space="preserve">Economic gameplay remains open: markets, contracts, logistics, businesses, PvP, organizations, and the eventual extraction rail use the same core rules.</w:t>
+        <w:t>Economic gameplay remains open: markets, contracts, logistics, businesses, PvP, organizations, Street Deed control and transfer, Broker activation and weighting, Stock Token allocation and token-bound delivery, and the eventual extraction rail use the same core gates as human play.</w:t>
       </w:r>
     </w:p>
     <w:p>
@@ -7128,13 +7117,7 @@
         </w:numPr>
       </w:pPr>
       <w:r>
-        <w:rPr>
-          <w:rFonts w:ascii="Aptos" w:cs="Aptos" w:eastAsia="Aptos" w:hAnsi="Aptos"/>
-          <w:color w:val="171717"/>
-          <w:sz w:val="21"/>
-          <w:szCs w:val="21"/>
-        </w:rPr>
-        <w:t xml:space="preserve">Agent cadence begins at one action per three seconds. The Capo's License can improve capability for recruiting qualifying real human players, but pays no referral cash.</w:t>
+        <w:t>Agent cadence begins at one action per three seconds. The Capo's License separately improves cadence and wire capacity for minted, retained, levelled human recruits; its capability ladder is independent from the one-use, budgeted qualified-activation cash claim.</w:t>
       </w:r>
     </w:p>
     <w:p>
@@ -7548,13 +7531,7 @@
         <w:pStyle w:val="Body"/>
       </w:pPr>
       <w:r>
-        <w:rPr>
-          <w:rFonts w:ascii="Aptos" w:cs="Aptos" w:eastAsia="Aptos" w:hAnsi="Aptos"/>
-          <w:color w:val="171717"/>
-          <w:sz w:val="22"/>
-          <w:szCs w:val="22"/>
-        </w:rPr>
-        <w:t xml:space="preserve">The current Solidity tree contains 20 contract source files and 28 declarations including interfaces. The implemented surface includes OMR, VoucherClaim, GearVault, OMRStaking, OmertaFees, OmertaBond, GenesisOracle, OmrTwapOracle, OmertaHook, StreetDeed, DynastyNFT, StockVault, StockTokenRegistry, RwaStockBuyer, and the Denari bank family - Denari, CollateralEscrow, Alchemist, Transmuter, and FlashGuard.</w:t>
+        <w:t>Published main contains 20 contract source files and 28 Solidity declarations including interfaces. The implemented surface includes OMR, VoucherClaim, GearVault, OMRStaking, OmertaFees, OmertaBond, GenesisOracle, OmrTwapOracle, OmertaHook, StreetDeed, DynastyNFT, StockVault, StockTokenRegistry, RwaStockBuyer, and the Denari bank family—Denari, CollateralEscrow, Alchemist, Transmuter, and FlashGuard. The active Grill v2 worktree adds the standalone native-only SettlementGasPool and immutable StockTokenRegistryV2 as separately reviewed, non-deployed components.</w:t>
       </w:r>
     </w:p>
     <w:tbl>
@@ -8428,13 +8405,31 @@
         <w:pStyle w:val="Body"/>
       </w:pPr>
       <w:r>
-        <w:rPr>
-          <w:rFonts w:ascii="Aptos" w:cs="Aptos" w:eastAsia="Aptos" w:hAnsi="Aptos"/>
-          <w:color w:val="171717"/>
-          <w:sz w:val="22"/>
-          <w:szCs w:val="22"/>
-        </w:rPr>
-        <w:t xml:space="preserve">Street Deeds and the Dynasty NFT represent durable, transferable identity or property proofs without allowing an NFT balance to replace the server's account entitlement. The Stock Token machine is designed as a treasury-funded, play-weighted distribution to qualifying human accounts: the server freezes activity, a distinct signer authorizes the exact asset and recipient, the vault transfers only pre-held tokens, and delivery waits for a qualifying deed account. The repository also records a founder-directed no-in-game-KYC posture. That posture is a product decision, not evidence of legal clearance; written launch review must evaluate it directly.</w:t>
+        <w:t>Street Deeds and the Dynasty NFT represent durable, transferable identity or property proofs without allowing an NFT balance to replace the server's account entitlement. Human and agent accounts use the same deed claim, control, market, extraction, re-import, Broker activation, activity, allocation, and delivery gates. A Stock Token allocation binds permanently to the selected extracted deed and its ERC-6551 token-bound account, follows canonical deed ownership, and remains pending without expiry when no valid destination exists.</w:t>
+      </w:r>
+    </w:p>
+    <w:p>
+      <w:pPr>
+        <w:pStyle w:val="Heading2"/>
+      </w:pPr>
+      <w:r>
+        <w:t>Grill v2 control plane</w:t>
+      </w:r>
+    </w:p>
+    <w:p>
+      <w:pPr>
+        <w:pStyle w:val="Body"/>
+      </w:pPr>
+      <w:r>
+        <w:t>The active Grill v2 branch has production-shaped implementations and tests for SettlementGasPool, StockTokenRegistryV2, the finalized Stock Token catalog mirror, public nomination and reviewer state machines, a dormant version-snapshot family ballot, and the shared finalized-observation kernel. This work does not grant production authority and has not been deployed.</w:t>
+      </w:r>
+    </w:p>
+    <w:p>
+      <w:pPr>
+        <w:pStyle w:val="Body"/>
+      </w:pPr>
+      <w:r>
+        <w:t>The approved remaining architecture adds finalized health and acquisition controllers, OMRGameplayVault with a dedicated delayed upgrade governor, finalized gameplay settlement, time-weighted Broker stake, operations UI, deployment packages, and launch gates. The vault keeps actual OMR principal fully backed across idle, active, committed, and unbonding buckets; prepared outcomes have no lock authority; one short-lived EIP-712 outcome settles only after canonical finality; gas credits are native-only and isolated; and no operator may use OMR, Stock Tokens, gameplay liabilities, RWA inventory, or withdrawal reserves as a substitute funding source.</w:t>
       </w:r>
     </w:p>
     <w:tbl>
@@ -10115,13 +10110,7 @@
         <w:pStyle w:val="Body"/>
       </w:pPr>
       <w:r>
-        <w:rPr>
-          <w:rFonts w:ascii="Aptos" w:cs="Aptos" w:eastAsia="Aptos" w:hAnsi="Aptos"/>
-          <w:color w:val="171717"/>
-          <w:sz w:val="22"/>
-          <w:szCs w:val="22"/>
-        </w:rPr>
-        <w:t xml:space="preserve">Agent accounts are excluded from those human anti-Sybil faucets. Their organization incentive is capability: build a useful crew, recruit real players, create liquidity and work, and qualify for the Capo's License through minted, retained, levelled human recruits. Off-platform agents must disclose their identity, avoid spam, and never promise income or token appreciation.</w:t>
+        <w:t>Agent accounts are eligible only for the direct, qualified, budgeted human-activation claim described above; human reach and social faucets remain excluded. Their broader organization incentive remains capability: build a useful crew, recruit real players, create liquidity and work, and qualify for the Capo's License through minted, retained, levelled human recruits. Off-platform agents must disclose their identity, avoid spam, and never promise income or token appreciation.</w:t>
       </w:r>
     </w:p>
     <w:p>
@@ -10347,13 +10336,7 @@
         </w:numPr>
       </w:pPr>
       <w:r>
-        <w:rPr>
-          <w:rFonts w:ascii="Aptos" w:cs="Aptos" w:eastAsia="Aptos" w:hAnsi="Aptos"/>
-          <w:color w:val="171717"/>
-          <w:sz w:val="21"/>
-          <w:szCs w:val="21"/>
-        </w:rPr>
-        <w:t xml:space="preserve">Agent contribution to useful economic actions without leakage into human-only faucets.</w:t>
+        <w:t>Agent contribution to useful economic actions, qualified real-human activation, and organization building without leakage into raw-reach or human social faucets.</w:t>
       </w:r>
     </w:p>
     <w:p>
@@ -11188,13 +11171,23 @@
         <w:pStyle w:val="Body"/>
       </w:pPr>
       <w:r>
-        <w:rPr>
-          <w:rFonts w:ascii="Aptos" w:cs="Aptos" w:eastAsia="Aptos" w:hAnsi="Aptos"/>
-          <w:color w:val="171717"/>
-          <w:sz w:val="22"/>
-          <w:szCs w:val="22"/>
-        </w:rPr>
-        <w:t xml:space="preserve">The repository includes substantial work on the bond/oracle/hook market, the Denari bank, treasury-funded external-asset allocation, Street Deeds and token-bound accounts, the Dynasty NFT, gear and property round-trips, and automated keepers. Their existence is evidence of design and implementation effort, not evidence that they are part of the first production cut. Each should retain an explicit activation gate, independent kill switch where appropriate, and a public status label.</w:t>
+        <w:t>Published main includes the content-graph compiler, the Sixth Chair authoring slice, Agent Turn v3, Deep City exploration, Agent Alpha, the bond/oracle/hook market, the Denari bank, treasury-funded external-asset allocation, Street Deeds and token-bound accounts, the Dynasty NFT, gear/property round-trips, and automated keepers. The active Grill v2 branch adds the finalized RWA control plane and custody foundations described above. Generic mystery runtime, durable inventory and crafting, selected-item export, complete Grill controllers and OMRGameplayVault integration, operator UI, deployment packages, and production activation remain staged. Each keeps a separate authority boundary, test gate, and public status label.</w:t>
+      </w:r>
+    </w:p>
+    <w:p>
+      <w:pPr>
+        <w:pStyle w:val="Heading2"/>
+      </w:pPr>
+      <w:r>
+        <w:t>Graph-driven expansion sequence</w:t>
+      </w:r>
+    </w:p>
+    <w:p>
+      <w:pPr>
+        <w:pStyle w:val="Body"/>
+      </w:pPr>
+      <w:r>
+        <w:t>The content graph expands in controlled stages: data-only authoring and immutable bundles first; generic mystery and inventory runtimes second; crafting, salvage, supply chains, and social-role execution after conservation and satisfiability proofs; owner-initiated hash-pinned export only for selected gameplay-inert items; and finite achievement-triggered seasonal $OMR only after operator activation. Compilation itself never publishes content or moves value.</w:t>
       </w:r>
     </w:p>
     <w:tbl>
@@ -11967,13 +11960,7 @@
         <w:pStyle w:val="Body"/>
       </w:pPr>
       <w:r>
-        <w:rPr>
-          <w:rFonts w:ascii="Aptos" w:cs="Aptos" w:eastAsia="Aptos" w:hAnsi="Aptos"/>
-          <w:color w:val="171717"/>
-          <w:sz w:val="22"/>
-          <w:szCs w:val="22"/>
-        </w:rPr>
-        <w:t xml:space="preserve">Autonomous agents extend the same logic. They receive a richer observation and execution contract, not economic privilege. Turn snapshots, server-side revalidation, strict idempotency, stable errors, and public fairness rules make machines legible participants. Their advantage is computation and persistence; their constraint is that the city still decides.</w:t>
+        <w:t>Autonomous agents extend the same logic. Agent Turn v3 and Agent Alpha provide richer observation, bounded exploration, durable mutation handling, and server-revalidated execution—not economic privilege or arbitrary authority. Street Deeds, Broker allocation, and eventual chain custody preserve identical economic gates, while qualified recruiting draws only from a finite acquisition reserve. Their advantage is computation and persistence; their constraint is that the city still decides.</w:t>
       </w:r>
     </w:p>
     <w:p>
@@ -11981,13 +11968,7 @@
         <w:pStyle w:val="Body"/>
       </w:pPr>
       <w:r>
-        <w:rPr>
-          <w:rFonts w:ascii="Aptos" w:cs="Aptos" w:eastAsia="Aptos" w:hAnsi="Aptos"/>
-          <w:color w:val="171717"/>
-          <w:sz w:val="22"/>
-          <w:szCs w:val="22"/>
-        </w:rPr>
-        <w:t xml:space="preserve">The remaining work is less about inventing systems than proving operation under real conditions: a populated first cohort, watched alarms, tested recovery, audited contracts and signer, verified custody, correct routing, deliberate caps, and a public status language that never gets ahead of production. If the project preserves that discipline, it can open each door on its own evidence instead of using the ambition of the next door to weaken the one in front of it.</w:t>
+        <w:t>The remaining work is to prove operation under real conditions while completing the staged graphs: a populated first cohort, watched alarms, tested recovery, audited contracts and signer, finalized RWA observation, fully backed OMRGameplayVault settlement, verified custody, correct routing, bounded content rewards, deliberate caps, and public status language that never gets ahead of production. Preserving that discipline lets each door open on its own evidence instead of using the ambition of the next door to weaken the one in front of it.</w:t>
       </w:r>
     </w:p>
     <w:tbl>
@@ -12306,20 +12287,8 @@
             <w:vAlign w:val="center"/>
           </w:tcPr>
           <w:p>
-            <w:pPr>
-              <w:spacing w:before="0" w:after="0" w:line="260" w:lineRule="auto"/>
-              <w:jc w:val="left"/>
-            </w:pPr>
-            <w:r>
-              <w:rPr>
-                <w:rFonts w:ascii="Aptos" w:cs="Aptos" w:eastAsia="Aptos" w:hAnsi="Aptos"/>
-                <w:b w:val="false"/>
-                <w:bCs w:val="false"/>
-                <w:color w:val="171717"/>
-                <w:sz w:val="18"/>
-                <w:szCs w:val="18"/>
-              </w:rPr>
-              <w:t xml:space="preserve">aa0265317d99 (generated knowledge inventory)</w:t>
+            <w:r>
+              <w:t>3a1f407fbfcc (published main; 27 Aug 2026)</w:t>
             </w:r>
           </w:p>
         </w:tc>
@@ -12383,20 +12352,8 @@
             <w:vAlign w:val="center"/>
           </w:tcPr>
           <w:p>
-            <w:pPr>
-              <w:spacing w:before="0" w:after="0" w:line="260" w:lineRule="auto"/>
-              <w:jc w:val="left"/>
-            </w:pPr>
-            <w:r>
-              <w:rPr>
-                <w:rFonts w:ascii="Aptos" w:cs="Aptos" w:eastAsia="Aptos" w:hAnsi="Aptos"/>
-                <w:b w:val="false"/>
-                <w:bCs w:val="false"/>
-                <w:color w:val="171717"/>
-                <w:sz w:val="18"/>
-                <w:szCs w:val="18"/>
-              </w:rPr>
-              <w:t xml:space="preserve">1,556</w:t>
+            <w:r>
+              <w:t>1,574</w:t>
             </w:r>
           </w:p>
         </w:tc>
@@ -12460,20 +12417,8 @@
             <w:vAlign w:val="center"/>
           </w:tcPr>
           <w:p>
-            <w:pPr>
-              <w:spacing w:before="0" w:after="0" w:line="260" w:lineRule="auto"/>
-              <w:jc w:val="left"/>
-            </w:pPr>
-            <w:r>
-              <w:rPr>
-                <w:rFonts w:ascii="Aptos" w:cs="Aptos" w:eastAsia="Aptos" w:hAnsi="Aptos"/>
-                <w:b w:val="false"/>
-                <w:bCs w:val="false"/>
-                <w:color w:val="171717"/>
-                <w:sz w:val="18"/>
-                <w:szCs w:val="18"/>
-              </w:rPr>
-              <w:t xml:space="preserve">379,266</w:t>
+            <w:r>
+              <w:t>390,757</w:t>
             </w:r>
           </w:p>
         </w:tc>
@@ -12537,20 +12482,8 @@
             <w:vAlign w:val="center"/>
           </w:tcPr>
           <w:p>
-            <w:pPr>
-              <w:spacing w:before="0" w:after="0" w:line="260" w:lineRule="auto"/>
-              <w:jc w:val="left"/>
-            </w:pPr>
-            <w:r>
-              <w:rPr>
-                <w:rFonts w:ascii="Aptos" w:cs="Aptos" w:eastAsia="Aptos" w:hAnsi="Aptos"/>
-                <w:b w:val="false"/>
-                <w:bCs w:val="false"/>
-                <w:color w:val="171717"/>
-                <w:sz w:val="18"/>
-                <w:szCs w:val="18"/>
-              </w:rPr>
-              <w:t xml:space="preserve">163</w:t>
+            <w:r>
+              <w:t>166</w:t>
             </w:r>
           </w:p>
         </w:tc>
@@ -12614,20 +12547,8 @@
             <w:vAlign w:val="center"/>
           </w:tcPr>
           <w:p>
-            <w:pPr>
-              <w:spacing w:before="0" w:after="0" w:line="260" w:lineRule="auto"/>
-              <w:jc w:val="left"/>
-            </w:pPr>
-            <w:r>
-              <w:rPr>
-                <w:rFonts w:ascii="Aptos" w:cs="Aptos" w:eastAsia="Aptos" w:hAnsi="Aptos"/>
-                <w:b w:val="false"/>
-                <w:bCs w:val="false"/>
-                <w:color w:val="171717"/>
-                <w:sz w:val="18"/>
-                <w:szCs w:val="18"/>
-              </w:rPr>
-              <w:t xml:space="preserve">713 / 712</w:t>
+            <w:r>
+              <w:t>713 / 713</w:t>
             </w:r>
           </w:p>
         </w:tc>
@@ -12691,20 +12612,8 @@
             <w:vAlign w:val="center"/>
           </w:tcPr>
           <w:p>
-            <w:pPr>
-              <w:spacing w:before="0" w:after="0" w:line="260" w:lineRule="auto"/>
-              <w:jc w:val="left"/>
-            </w:pPr>
-            <w:r>
-              <w:rPr>
-                <w:rFonts w:ascii="Aptos" w:cs="Aptos" w:eastAsia="Aptos" w:hAnsi="Aptos"/>
-                <w:b w:val="false"/>
-                <w:bCs w:val="false"/>
-                <w:color w:val="171717"/>
-                <w:sz w:val="18"/>
-                <w:szCs w:val="18"/>
-              </w:rPr>
-              <w:t xml:space="preserve">245</w:t>
+            <w:r>
+              <w:t>247</w:t>
             </w:r>
           </w:p>
         </w:tc>
@@ -12768,20 +12677,8 @@
             <w:vAlign w:val="center"/>
           </w:tcPr>
           <w:p>
-            <w:pPr>
-              <w:spacing w:before="0" w:after="0" w:line="260" w:lineRule="auto"/>
-              <w:jc w:val="left"/>
-            </w:pPr>
-            <w:r>
-              <w:rPr>
-                <w:rFonts w:ascii="Aptos" w:cs="Aptos" w:eastAsia="Aptos" w:hAnsi="Aptos"/>
-                <w:b w:val="false"/>
-                <w:bCs w:val="false"/>
-                <w:color w:val="171717"/>
-                <w:sz w:val="18"/>
-                <w:szCs w:val="18"/>
-              </w:rPr>
-              <w:t xml:space="preserve">28 across 20 contract source files</w:t>
+            <w:r>
+              <w:t>28 across 20 published-main contract source files</w:t>
             </w:r>
           </w:p>
         </w:tc>
@@ -12845,20 +12742,8 @@
             <w:vAlign w:val="center"/>
           </w:tcPr>
           <w:p>
-            <w:pPr>
-              <w:spacing w:before="0" w:after="0" w:line="260" w:lineRule="auto"/>
-              <w:jc w:val="left"/>
-            </w:pPr>
-            <w:r>
-              <w:rPr>
-                <w:rFonts w:ascii="Aptos" w:cs="Aptos" w:eastAsia="Aptos" w:hAnsi="Aptos"/>
-                <w:b w:val="false"/>
-                <w:bCs w:val="false"/>
-                <w:color w:val="171717"/>
-                <w:sz w:val="18"/>
-                <w:szCs w:val="18"/>
-              </w:rPr>
-              <w:t xml:space="preserve">168</w:t>
+            <w:r>
+              <w:t>171</w:t>
             </w:r>
           </w:p>
         </w:tc>
@@ -12922,20 +12807,8 @@
             <w:vAlign w:val="center"/>
           </w:tcPr>
           <w:p>
-            <w:pPr>
-              <w:spacing w:before="0" w:after="0" w:line="260" w:lineRule="auto"/>
-              <w:jc w:val="left"/>
-            </w:pPr>
-            <w:r>
-              <w:rPr>
-                <w:rFonts w:ascii="Aptos" w:cs="Aptos" w:eastAsia="Aptos" w:hAnsi="Aptos"/>
-                <w:b w:val="false"/>
-                <w:bCs w:val="false"/>
-                <w:color w:val="171717"/>
-                <w:sz w:val="18"/>
-                <w:szCs w:val="18"/>
-              </w:rPr>
-              <w:t xml:space="preserve">938</w:t>
+            <w:r>
+              <w:t>1,022</w:t>
             </w:r>
           </w:p>
         </w:tc>
@@ -12999,20 +12872,8 @@
             <w:vAlign w:val="center"/>
           </w:tcPr>
           <w:p>
-            <w:pPr>
-              <w:spacing w:before="0" w:after="0" w:line="260" w:lineRule="auto"/>
-              <w:jc w:val="left"/>
-            </w:pPr>
-            <w:r>
-              <w:rPr>
-                <w:rFonts w:ascii="Aptos" w:cs="Aptos" w:eastAsia="Aptos" w:hAnsi="Aptos"/>
-                <w:b w:val="false"/>
-                <w:bCs w:val="false"/>
-                <w:color w:val="171717"/>
-                <w:sz w:val="18"/>
-                <w:szCs w:val="18"/>
-              </w:rPr>
-              <w:t xml:space="preserve">4,451 / 20,943</w:t>
+            <w:r>
+              <w:t>4,570 / 21,535</w:t>
             </w:r>
           </w:p>
         </w:tc>
@@ -13076,20 +12937,8 @@
             <w:vAlign w:val="center"/>
           </w:tcPr>
           <w:p>
-            <w:pPr>
-              <w:spacing w:before="0" w:after="0" w:line="260" w:lineRule="auto"/>
-              <w:jc w:val="left"/>
-            </w:pPr>
-            <w:r>
-              <w:rPr>
-                <w:rFonts w:ascii="Aptos" w:cs="Aptos" w:eastAsia="Aptos" w:hAnsi="Aptos"/>
-                <w:b w:val="false"/>
-                <w:bCs w:val="false"/>
-                <w:color w:val="171717"/>
-                <w:sz w:val="18"/>
-                <w:szCs w:val="18"/>
-              </w:rPr>
-              <w:t xml:space="preserve">529</w:t>
+            <w:r>
+              <w:t>530</w:t>
             </w:r>
           </w:p>
         </w:tc>
@@ -13122,13 +12971,7 @@
         <w:pStyle w:val="Body"/>
       </w:pPr>
       <w:r>
-        <w:rPr>
-          <w:rFonts w:ascii="Aptos" w:cs="Aptos" w:eastAsia="Aptos" w:hAnsi="Aptos"/>
-          <w:color w:val="171717"/>
-          <w:sz w:val="22"/>
-          <w:szCs w:val="22"/>
-        </w:rPr>
-        <w:t xml:space="preserve">On 25 August 2026, the production public OpenAPI document reported OpenAPI 3.1.0 and exposed 636 operations across 616 paths. The public API excludes moderator routes, and the deployed branch can lag or differ from the local worktree; the live registry and generated repository inventory therefore answer different questions.</w:t>
+        <w:t>The production OpenAPI document is derived from the routes mounted on the deployed origin, while the repository inventory measures the selected source revision. Those two censuses answer different questions and can move on different schedules. Recheck the live document and the generated inventory together before quoting operation or route counts.</w:t>
       </w:r>
     </w:p>
     <w:p>
@@ -15695,20 +15538,8 @@
             <w:vAlign w:val="center"/>
           </w:tcPr>
           <w:p>
-            <w:pPr>
-              <w:spacing w:before="0" w:after="0" w:line="260" w:lineRule="auto"/>
-              <w:jc w:val="left"/>
-            </w:pPr>
-            <w:r>
-              <w:rPr>
-                <w:rFonts w:ascii="Aptos" w:cs="Aptos" w:eastAsia="Aptos" w:hAnsi="Aptos"/>
-                <w:b w:val="false"/>
-                <w:bCs w:val="false"/>
-                <w:color w:val="171717"/>
-                <w:sz w:val="17"/>
-                <w:szCs w:val="17"/>
-              </w:rPr>
-              <w:t xml:space="preserve">Capability tiers for qualifying human recruitment; it changes agent cadence or wire capacity, not referral cash.</w:t>
+            <w:r>
+              <w:t>Capability tiers for minted, retained, levelled human recruitment; cadence and wire capacity are separate from the finite qualified-activation cash claim.</w:t>
             </w:r>
           </w:p>
         </w:tc>
@@ -16479,6 +16310,116 @@
                 <w:szCs w:val="17"/>
               </w:rPr>
               <w:t xml:space="preserve">Separate release gates for the off-chain game, agent channel, and production chain.</w:t>
+            </w:r>
+          </w:p>
+        </w:tc>
+      </w:tr>
+      <w:tr>
+        <w:tc>
+          <w:tcPr>
+            <w:tcW w:type="dxa" w:w="2200"/>
+          </w:tcPr>
+          <w:p>
+            <w:r>
+              <w:t>Agent Turn v3</w:t>
+            </w:r>
+          </w:p>
+        </w:tc>
+        <w:tc>
+          <w:tcPr>
+            <w:tcW w:type="dxa" w:w="7160"/>
+          </w:tcPr>
+          <w:p>
+            <w:r>
+              <w:t>Server-issued EV-ranked action snapshot plus a separate read-only 40-system exploration object; one mutation invalidates sibling actions.</w:t>
+            </w:r>
+          </w:p>
+        </w:tc>
+      </w:tr>
+      <w:tr>
+        <w:tc>
+          <w:tcPr>
+            <w:tcW w:type="dxa" w:w="2200"/>
+          </w:tcPr>
+          <w:p>
+            <w:r>
+              <w:t>Agent Alpha</w:t>
+            </w:r>
+          </w:p>
+        </w:tc>
+        <w:tc>
+          <w:tcPr>
+            <w:tcW w:type="dxa" w:w="7160"/>
+          </w:tcPr>
+          <w:p>
+            <w:r>
+              <w:t>Bounded owner-operated reference runner for one durable identity; allowlisted actions, finite budget, mutation journal, no fleet authority.</w:t>
+            </w:r>
+          </w:p>
+        </w:tc>
+      </w:tr>
+      <w:tr>
+        <w:tc>
+          <w:tcPr>
+            <w:tcW w:type="dxa" w:w="2200"/>
+          </w:tcPr>
+          <w:p>
+            <w:r>
+              <w:t>Content graph</w:t>
+            </w:r>
+          </w:p>
+        </w:tc>
+        <w:tc>
+          <w:tcPr>
+            <w:tcW w:type="dxa" w:w="7160"/>
+          </w:tcPr>
+          <w:p>
+            <w:r>
+              <w:t>Data-only, versioned mystery/item/social/reward packs validated and hashed before any separate operator activation.</w:t>
+            </w:r>
+          </w:p>
+        </w:tc>
+      </w:tr>
+      <w:tr>
+        <w:tc>
+          <w:tcPr>
+            <w:tcW w:type="dxa" w:w="2200"/>
+          </w:tcPr>
+          <w:p>
+            <w:r>
+              <w:t>Grill v2</w:t>
+            </w:r>
+          </w:p>
+        </w:tc>
+        <w:tc>
+          <w:tcPr>
+            <w:tcW w:type="dxa" w:w="7160"/>
+          </w:tcPr>
+          <w:p>
+            <w:r>
+              <w:t>Dependency-ordered RWA and OMR custody implementation program; active-branch code and approved architecture do not imply deployment.</w:t>
+            </w:r>
+          </w:p>
+        </w:tc>
+      </w:tr>
+      <w:tr>
+        <w:tc>
+          <w:tcPr>
+            <w:tcW w:type="dxa" w:w="2200"/>
+          </w:tcPr>
+          <w:p>
+            <w:r>
+              <w:t>Street Deed TBA</w:t>
+            </w:r>
+          </w:p>
+        </w:tc>
+        <w:tc>
+          <w:tcPr>
+            <w:tcW w:type="dxa" w:w="7160"/>
+          </w:tcPr>
+          <w:p>
+            <w:r>
+              <w:t>ERC-6551 token-bound destination for permanent Stock Token allocations that follow canonical deed ownership.</w:t>
             </w:r>
           </w:p>
         </w:tc>
@@ -17177,83 +17118,6 @@
           </w:p>
         </w:tc>
       </w:tr>
-      <w:tr>
-        <w:trPr>
-          <w:cantSplit/>
-        </w:trPr>
-        <w:tc>
-          <w:tcPr>
-            <w:tcW w:type="dxa" w:w="1800"/>
-            <w:tcBorders>
-              <w:top w:val="single" w:color="D8D5CF" w:sz="4"/>
-              <w:left w:val="single" w:color="D8D5CF" w:sz="4"/>
-              <w:bottom w:val="single" w:color="D8D5CF" w:sz="4"/>
-              <w:right w:val="single" w:color="D8D5CF" w:sz="4"/>
-            </w:tcBorders>
-            <w:shd w:fill="F8F7F4" w:color="auto" w:val="clear"/>
-            <w:tcMar>
-              <w:top w:type="dxa" w:w="100"/>
-              <w:left w:type="dxa" w:w="140"/>
-              <w:bottom w:type="dxa" w:w="100"/>
-              <w:right w:type="dxa" w:w="140"/>
-            </w:tcMar>
-            <w:vAlign w:val="center"/>
-          </w:tcPr>
-          <w:p>
-            <w:pPr>
-              <w:spacing w:before="0" w:after="0" w:line="260" w:lineRule="auto"/>
-              <w:jc w:val="left"/>
-            </w:pPr>
-            <w:r>
-              <w:rPr>
-                <w:rFonts w:ascii="Aptos" w:cs="Aptos" w:eastAsia="Aptos" w:hAnsi="Aptos"/>
-                <w:b/>
-                <w:bCs/>
-                <w:color w:val="171717"/>
-                <w:sz w:val="18"/>
-                <w:szCs w:val="18"/>
-              </w:rPr>
-              <w:t xml:space="preserve">Retired</w:t>
-            </w:r>
-          </w:p>
-        </w:tc>
-        <w:tc>
-          <w:tcPr>
-            <w:tcW w:type="dxa" w:w="7560"/>
-            <w:tcBorders>
-              <w:top w:val="single" w:color="D8D5CF" w:sz="4"/>
-              <w:left w:val="single" w:color="D8D5CF" w:sz="4"/>
-              <w:bottom w:val="single" w:color="D8D5CF" w:sz="4"/>
-              <w:right w:val="single" w:color="D8D5CF" w:sz="4"/>
-            </w:tcBorders>
-            <w:shd w:fill="F8F7F4" w:color="auto" w:val="clear"/>
-            <w:tcMar>
-              <w:top w:type="dxa" w:w="100"/>
-              <w:left w:type="dxa" w:w="140"/>
-              <w:bottom w:type="dxa" w:w="100"/>
-              <w:right w:type="dxa" w:w="140"/>
-            </w:tcMar>
-            <w:vAlign w:val="center"/>
-          </w:tcPr>
-          <w:p>
-            <w:pPr>
-              <w:spacing w:before="0" w:after="0" w:line="260" w:lineRule="auto"/>
-              <w:jc w:val="left"/>
-            </w:pPr>
-            <w:r>
-              <w:rPr>
-                <w:rFonts w:ascii="Aptos" w:cs="Aptos" w:eastAsia="Aptos" w:hAnsi="Aptos"/>
-                <w:b w:val="false"/>
-                <w:bCs w:val="false"/>
-                <w:color w:val="171717"/>
-                <w:sz w:val="18"/>
-                <w:szCs w:val="18"/>
-              </w:rPr>
-              <w:t xml:space="preserve">An old route or rule intentionally remains unavailable and should return a stable retirement error where applicable.</w:t>
-            </w:r>
-          </w:p>
-        </w:tc>
-      </w:tr>
     </w:tbl>
     <w:p>
       <w:pPr>
@@ -17281,13 +17145,7 @@
         </w:numPr>
       </w:pPr>
       <w:r>
-        <w:rPr>
-          <w:rFonts w:ascii="Aptos" w:cs="Aptos" w:eastAsia="Aptos" w:hAnsi="Aptos"/>
-          <w:color w:val="2B2926"/>
-          <w:sz w:val="18"/>
-          <w:szCs w:val="18"/>
-        </w:rPr>
-        <w:t xml:space="preserve">OMERTÀ knowledge base and generated inventory: knowledge/README.md; knowledge/generated/inventory.md; knowledge/generated/graph-summary.md (repository snapshot aa0265317d99).</w:t>
+        <w:t>OMERTÀ knowledge base and generated inventory: knowledge/README.md; knowledge/generated/inventory.md; knowledge/generated/graph-summary.md (published-main census: 1,574 artifacts; 4,570 nodes; 21,535 edges).</w:t>
       </w:r>
     </w:p>
     <w:p>
@@ -17479,13 +17337,23 @@
         </w:numPr>
       </w:pPr>
       <w:r>
-        <w:rPr>
-          <w:rFonts w:ascii="Aptos" w:cs="Aptos" w:eastAsia="Aptos" w:hAnsi="Aptos"/>
-          <w:color w:val="2B2926"/>
-          <w:sz w:val="18"/>
-          <w:szCs w:val="18"/>
-        </w:rPr>
-        <w:t xml:space="preserve">Runtime implementation: src/, schema.sql, test/, tools/, render.yaml, and .github/workflows/.</w:t>
+        <w:t>Runtime implementation: src/, schema.sql, test/, tools/, content/, render.yaml, and .github/workflows/.</w:t>
+      </w:r>
+    </w:p>
+    <w:p>
+      <w:pPr>
+        <w:pStyle w:val="Reference"/>
+      </w:pPr>
+      <w:r>
+        <w:t>Graph-driven OMR expansion: content/README.md; content/schemas/; content/packs/sixth-chair/; tools/content/; src/agentreferrals.js.</w:t>
+      </w:r>
+    </w:p>
+    <w:p>
+      <w:pPr>
+        <w:pStyle w:val="Reference"/>
+      </w:pPr>
+      <w:r>
+        <w:t>Grill v2 implementation and authority model: docs/superpowers/specs/2026-08-26-grill-completion.md and the active codex/grill-completion branch, including finalized observation, StockTokenRegistryV2, StockCatalogV2, RWA nominations, dormant ballot, and SettlementGasPool work.</w:t>
       </w:r>
     </w:p>
     <w:p>
@@ -17515,13 +17383,7 @@
         </w:numPr>
       </w:pPr>
       <w:r>
-        <w:rPr>
-          <w:rFonts w:ascii="Aptos" w:cs="Aptos" w:eastAsia="Aptos" w:hAnsi="Aptos"/>
-          <w:color w:val="2B2926"/>
-          <w:sz w:val="18"/>
-          <w:szCs w:val="18"/>
-        </w:rPr>
-        <w:t xml:space="preserve">Live public sources accessed 25 August 2026: https://www.omerta.fun/ ; /v1/arena ; /v1/rules ; /openapi.json ; /llms.txt ; /agents.</w:t>
+        <w:t>Live public sources accessed 27 August 2026: https://www.omerta.fun/ ; /v1/arena ; /v1/rules ; /openapi.json ; /llms.txt ; /agents.</w:t>
       </w:r>
     </w:p>
     <w:p>
@@ -17579,24 +17441,7 @@
               <w:pStyle w:val="Callout"/>
             </w:pPr>
             <w:r>
-              <w:rPr>
-                <w:rFonts w:ascii="Aptos" w:cs="Aptos" w:eastAsia="Aptos" w:hAnsi="Aptos"/>
-                <w:b/>
-                <w:bCs/>
-                <w:color w:val="315C75"/>
-                <w:sz w:val="18"/>
-                <w:szCs w:val="18"/>
-              </w:rPr>
-              <w:t xml:space="preserve">VERSION DISCIPLINE  </w:t>
-            </w:r>
-            <w:r>
-              <w:rPr>
-                <w:rFonts w:ascii="Aptos" w:cs="Aptos" w:eastAsia="Aptos" w:hAnsi="Aptos"/>
-                <w:color w:val="171717"/>
-                <w:sz w:val="20"/>
-                <w:szCs w:val="20"/>
-              </w:rPr>
-              <w:t xml:space="preserve">Regenerate repository counts and re-check the live public status before quoting this paper after 25 August 2026. The project moves quickly, and a whitepaper must never outrank the source tree.</w:t>
+              <w:t>VERSION DISCIPLINE  Regenerate repository counts and re-check the live public status before quoting this paper. The project moves quickly, and the whitepaper must never outrank the source tree, deployed configuration, or named launch gates.</w:t>
             </w:r>
           </w:p>
         </w:tc>

</xml_diff>